<commit_message>
Add office address to site and letterheads
</commit_message>
<xml_diff>
--- a/letterheads/accolyx-a4-letterhead.docx
+++ b/letterheads/accolyx-a4-letterhead.docx
@@ -345,6 +345,21 @@
         <w:sz w:val="15"/>
       </w:rPr>
       <w:t>Accolyx | info@accolyx.com | www.accolyx.com</w:t>
+    </w:r>
+  </w:p>
+  <w:p>
+    <w:pPr>
+      <w:spacing w:before="20" w:after="0"/>
+      <w:jc w:val="center"/>
+    </w:pPr>
+    <w:r>
+      <w:rPr>
+        <w:rFonts w:ascii="Arial" w:hAnsi="Arial" w:eastAsia="Arial"/>
+        <w:b w:val="0"/>
+        <w:color w:val="686D66"/>
+        <w:sz w:val="15"/>
+      </w:rPr>
+      <w:t>2nd Floor, Central Mall, opposite Giga Mall, GT Road, DHA PHASE 02 Islamabad 44000.</w:t>
     </w:r>
   </w:p>
 </w:ftr>

</xml_diff>